<commit_message>
Added PBI 1st Edition
</commit_message>
<xml_diff>
--- a/UB_Flowchart.docx
+++ b/UB_Flowchart.docx
@@ -571,15 +571,7 @@
                               <w:jc w:val="center"/>
                             </w:pPr>
                             <w:r>
-                              <w:t xml:space="preserve">Scrape Data </w:t>
-                            </w:r>
-                            <w:proofErr w:type="gramStart"/>
-                            <w:r>
-                              <w:t>From</w:t>
-                            </w:r>
-                            <w:proofErr w:type="gramEnd"/>
-                            <w:r>
-                              <w:t xml:space="preserve"> UB </w:t>
+                              <w:t xml:space="preserve">Scrape Data From UB </w:t>
                             </w:r>
                           </w:p>
                         </w:txbxContent>
@@ -612,15 +604,7 @@
                         <w:jc w:val="center"/>
                       </w:pPr>
                       <w:r>
-                        <w:t xml:space="preserve">Scrape Data </w:t>
-                      </w:r>
-                      <w:proofErr w:type="gramStart"/>
-                      <w:r>
-                        <w:t>From</w:t>
-                      </w:r>
-                      <w:proofErr w:type="gramEnd"/>
-                      <w:r>
-                        <w:t xml:space="preserve"> UB </w:t>
+                        <w:t xml:space="preserve">Scrape Data From UB </w:t>
                       </w:r>
                     </w:p>
                   </w:txbxContent>
@@ -894,10 +878,7 @@
                               <w:jc w:val="center"/>
                             </w:pPr>
                             <w:r>
-                              <w:t>titles</w:t>
-                            </w:r>
-                            <w:r>
-                              <w:t>.csv</w:t>
+                              <w:t>titles.csv</w:t>
                             </w:r>
                           </w:p>
                         </w:txbxContent>
@@ -930,10 +911,7 @@
                         <w:jc w:val="center"/>
                       </w:pPr>
                       <w:r>
-                        <w:t>titles</w:t>
-                      </w:r>
-                      <w:r>
-                        <w:t>.csv</w:t>
+                        <w:t>titles.csv</w:t>
                       </w:r>
                     </w:p>
                   </w:txbxContent>
@@ -1000,15 +978,15 @@
                               <w:jc w:val="center"/>
                             </w:pPr>
                             <w:r>
-                              <w:t>Scrape B</w:t>
+                              <w:t xml:space="preserve">Scrape </w:t>
                             </w:r>
                             <w:proofErr w:type="spellStart"/>
                             <w:r>
-                              <w:t>rgy</w:t>
+                              <w:t>Brgy</w:t>
                             </w:r>
                             <w:proofErr w:type="spellEnd"/>
                             <w:r>
-                              <w:t xml:space="preserve"> | City Address and Lot Description from </w:t>
+                              <w:t xml:space="preserve"> | City Address and Lot Description</w:t>
                             </w:r>
                           </w:p>
                         </w:txbxContent>
@@ -1041,15 +1019,15 @@
                         <w:jc w:val="center"/>
                       </w:pPr>
                       <w:r>
-                        <w:t>Scrape B</w:t>
+                        <w:t xml:space="preserve">Scrape </w:t>
                       </w:r>
                       <w:proofErr w:type="spellStart"/>
                       <w:r>
-                        <w:t>rgy</w:t>
+                        <w:t>Brgy</w:t>
                       </w:r>
                       <w:proofErr w:type="spellEnd"/>
                       <w:r>
-                        <w:t xml:space="preserve"> | City Address and Lot Description from </w:t>
+                        <w:t xml:space="preserve"> | City Address and Lot Description</w:t>
                       </w:r>
                     </w:p>
                   </w:txbxContent>

</xml_diff>